<commit_message>
Retrait de fr-CA dans les formats de date, bouton Ouvrir le PDF, note sur le groupe de sécurité
Co-Authored-By: Claude Opus 5.5 <noreply@anthropic.com>
Claude-Session: https://claude.ai/code/session_01FRdAzq8p3F9gJJe5MA3G79
</commit_message>
<xml_diff>
--- a/powerapps/GUIDE-MISE-EN-PRODUCTION.docx
+++ b/powerapps/GUIDE-MISE-EN-PRODUCTION.docx
@@ -2226,7 +2226,7 @@
               <w:jc w:val="left"/>
             </w:pPr>
             <w:r>
-              <w:t xml:space="preserve">Onglet Synthèse (moyennes)</w:t>
+              <w:t xml:space="preserve">Onglet Synthèse (moyennes) et toutes les dates</w:t>
             </w:r>
           </w:p>
         </w:tc>
@@ -2262,7 +2262,7 @@
               <w:t xml:space="preserve"> </w:t>
             </w:r>
             <w:r>
-              <w:t xml:space="preserve">était refusé, et</w:t>
+              <w:t xml:space="preserve">était refusé.</w:t>
             </w:r>
             <w:r>
               <w:t xml:space="preserve"> </w:t>
@@ -2277,7 +2277,32 @@
               <w:t xml:space="preserve"> </w:t>
             </w:r>
             <w:r>
-              <w:t xml:space="preserve">donnait « Code de langue fr-CA non pris en charge ».</w:t>
+              <w:rPr>
+                <w:bCs/>
+                <w:b/>
+              </w:rPr>
+              <w:t xml:space="preserve">et</w:t>
+            </w:r>
+            <w:r>
+              <w:t xml:space="preserve"> </w:t>
+            </w:r>
+            <w:r>
+              <w:t xml:space="preserve">les formats</w:t>
+            </w:r>
+            <w:r>
+              <w:t xml:space="preserve"> </w:t>
+            </w:r>
+            <w:r>
+              <w:rPr>
+                <w:rStyle w:val="VerbatimChar"/>
+              </w:rPr>
+              <w:t xml:space="preserve">"[$-fr-CA]d mmmm yyyy"</w:t>
+            </w:r>
+            <w:r>
+              <w:t xml:space="preserve"> </w:t>
+            </w:r>
+            <w:r>
+              <w:t xml:space="preserve">donnaient « Code de langue fr-CA non pris en charge ».</w:t>
             </w:r>
           </w:p>
         </w:tc>
@@ -2304,7 +2329,23 @@
               <w:t xml:space="preserve"> </w:t>
             </w:r>
             <w:r>
-              <w:t xml:space="preserve">et sans</w:t>
+              <w:t xml:space="preserve">;</w:t>
+            </w:r>
+            <w:r>
+              <w:t xml:space="preserve"> </w:t>
+            </w:r>
+            <w:r>
+              <w:rPr>
+                <w:bCs/>
+                <w:b/>
+              </w:rPr>
+              <w:t xml:space="preserve">aucun « fr-CA »</w:t>
+            </w:r>
+            <w:r>
+              <w:t xml:space="preserve"> </w:t>
+            </w:r>
+            <w:r>
+              <w:t xml:space="preserve">dans l’application (chercher</w:t>
             </w:r>
             <w:r>
               <w:t xml:space="preserve"> </w:t>
@@ -2313,13 +2354,157 @@
               <w:rPr>
                 <w:rStyle w:val="VerbatimChar"/>
               </w:rPr>
-              <w:t xml:space="preserve">"fr-CA"</w:t>
-            </w:r>
-            <w:r>
-              <w:t xml:space="preserve"> </w:t>
-            </w:r>
-            <w:r>
-              <w:t xml:space="preserve">(partie 5).</w:t>
+              <w:t xml:space="preserve">[$-fr-CA]</w:t>
+            </w:r>
+            <w:r>
+              <w:t xml:space="preserve"> </w:t>
+            </w:r>
+            <w:r>
+              <w:t xml:space="preserve">avec la loupe et l’effacer). Voir</w:t>
+            </w:r>
+            <w:r>
+              <w:t xml:space="preserve"> </w:t>
+            </w:r>
+            <w:r>
+              <w:rPr>
+                <w:rStyle w:val="VerbatimChar"/>
+              </w:rPr>
+              <w:t xml:space="preserve">FORMULES-POWERAPPS-FINALES.txt</w:t>
+            </w:r>
+            <w:r>
+              <w:t xml:space="preserve">, partie 9.</w:t>
+            </w:r>
+          </w:p>
+        </w:tc>
+      </w:tr>
+      <w:tr>
+        <w:tc>
+          <w:tcPr/>
+          <w:p>
+            <w:pPr>
+              <w:pStyle w:val="Compact"/>
+              <w:jc w:val="left"/>
+            </w:pPr>
+            <w:r>
+              <w:t xml:space="preserve">18</w:t>
+            </w:r>
+          </w:p>
+        </w:tc>
+        <w:tc>
+          <w:tcPr/>
+          <w:p>
+            <w:pPr>
+              <w:pStyle w:val="Compact"/>
+              <w:jc w:val="left"/>
+            </w:pPr>
+            <w:r>
+              <w:t xml:space="preserve">Bouton Aperçu PDF</w:t>
+            </w:r>
+          </w:p>
+        </w:tc>
+        <w:tc>
+          <w:tcPr/>
+          <w:p>
+            <w:pPr>
+              <w:pStyle w:val="Compact"/>
+              <w:jc w:val="left"/>
+            </w:pPr>
+            <w:r>
+              <w:t xml:space="preserve">Le PDF ne s’ouvrait pas : le navigateur bloque l’onglet ouvert 10 à 30 secondes après le clic.</w:t>
+            </w:r>
+          </w:p>
+        </w:tc>
+        <w:tc>
+          <w:tcPr/>
+          <w:p>
+            <w:pPr>
+              <w:pStyle w:val="Compact"/>
+              <w:jc w:val="left"/>
+            </w:pPr>
+            <w:r>
+              <w:t xml:space="preserve">Nouveau bouton</w:t>
+            </w:r>
+            <w:r>
+              <w:t xml:space="preserve"> </w:t>
+            </w:r>
+            <w:r>
+              <w:rPr>
+                <w:bCs/>
+                <w:b/>
+              </w:rPr>
+              <w:t xml:space="preserve">📄 Ouvrir le PDF</w:t>
+            </w:r>
+            <w:r>
+              <w:t xml:space="preserve"> </w:t>
+            </w:r>
+            <w:r>
+              <w:t xml:space="preserve">(partie 10 du fichier des formules).</w:t>
+            </w:r>
+          </w:p>
+        </w:tc>
+      </w:tr>
+      <w:tr>
+        <w:tc>
+          <w:tcPr/>
+          <w:p>
+            <w:pPr>
+              <w:pStyle w:val="Compact"/>
+              <w:jc w:val="left"/>
+            </w:pPr>
+            <w:r>
+              <w:t xml:space="preserve">19</w:t>
+            </w:r>
+          </w:p>
+        </w:tc>
+        <w:tc>
+          <w:tcPr/>
+          <w:p>
+            <w:pPr>
+              <w:pStyle w:val="Compact"/>
+              <w:jc w:val="left"/>
+            </w:pPr>
+            <w:r>
+              <w:t xml:space="preserve">Tests avec d’autres comptes</w:t>
+            </w:r>
+          </w:p>
+        </w:tc>
+        <w:tc>
+          <w:tcPr/>
+          <w:p>
+            <w:pPr>
+              <w:pStyle w:val="Compact"/>
+              <w:jc w:val="left"/>
+            </w:pPr>
+            <w:r>
+              <w:t xml:space="preserve">« You are not a member of the environment’s security group »</w:t>
+            </w:r>
+          </w:p>
+        </w:tc>
+        <w:tc>
+          <w:tcPr/>
+          <w:p>
+            <w:pPr>
+              <w:pStyle w:val="Compact"/>
+              <w:jc w:val="left"/>
+            </w:pPr>
+            <w:r>
+              <w:t xml:space="preserve">Normal dans le bac à sable : seules les personnes du</w:t>
+            </w:r>
+            <w:r>
+              <w:t xml:space="preserve"> </w:t>
+            </w:r>
+            <w:r>
+              <w:rPr>
+                <w:bCs/>
+                <w:b/>
+              </w:rPr>
+              <w:t xml:space="preserve">groupe de sécurité</w:t>
+            </w:r>
+            <w:r>
+              <w:t xml:space="preserve"> </w:t>
+            </w:r>
+            <w:r>
+              <w:t xml:space="preserve">de l’environnement peuvent ouvrir l’application. Les TI doivent y ajouter les testeurs, et prévoir le bon groupe en pré-prod et en prod.</w:t>
             </w:r>
           </w:p>
         </w:tc>
@@ -6302,17 +6487,120 @@
               </w:rPr>
               <w:t xml:space="preserve">Text(…; "fr-CA")</w:t>
             </w:r>
-          </w:p>
-        </w:tc>
-        <w:tc>
-          <w:tcPr/>
-          <w:p>
-            <w:pPr>
-              <w:pStyle w:val="Compact"/>
-              <w:jc w:val="left"/>
-            </w:pPr>
-            <w:r>
-              <w:t xml:space="preserve">Retirer le 3ᵉ argument</w:t>
+            <w:r>
+              <w:t xml:space="preserve"> </w:t>
+            </w:r>
+            <w:r>
+              <w:t xml:space="preserve">ou un format</w:t>
+            </w:r>
+            <w:r>
+              <w:t xml:space="preserve"> </w:t>
+            </w:r>
+            <w:r>
+              <w:rPr>
+                <w:rStyle w:val="VerbatimChar"/>
+              </w:rPr>
+              <w:t xml:space="preserve">[$-fr-CA]</w:t>
+            </w:r>
+          </w:p>
+        </w:tc>
+        <w:tc>
+          <w:tcPr/>
+          <w:p>
+            <w:pPr>
+              <w:pStyle w:val="Compact"/>
+              <w:jc w:val="left"/>
+            </w:pPr>
+            <w:r>
+              <w:t xml:space="preserve">Retirer « fr-CA » partout (loupe ›</w:t>
+            </w:r>
+            <w:r>
+              <w:t xml:space="preserve"> </w:t>
+            </w:r>
+            <w:r>
+              <w:rPr>
+                <w:rStyle w:val="VerbatimChar"/>
+              </w:rPr>
+              <w:t xml:space="preserve">[$-fr-CA]</w:t>
+            </w:r>
+            <w:r>
+              <w:t xml:space="preserve">)</w:t>
+            </w:r>
+          </w:p>
+        </w:tc>
+      </w:tr>
+      <w:tr>
+        <w:tc>
+          <w:tcPr/>
+          <w:p>
+            <w:pPr>
+              <w:pStyle w:val="Compact"/>
+              <w:jc w:val="left"/>
+            </w:pPr>
+            <w:r>
+              <w:t xml:space="preserve">Le PDF est créé, mais ne s’ouvre pas</w:t>
+            </w:r>
+          </w:p>
+        </w:tc>
+        <w:tc>
+          <w:tcPr/>
+          <w:p>
+            <w:pPr>
+              <w:pStyle w:val="Compact"/>
+              <w:jc w:val="left"/>
+            </w:pPr>
+            <w:r>
+              <w:t xml:space="preserve">Ouverture d’onglet bloquée par le navigateur</w:t>
+            </w:r>
+          </w:p>
+        </w:tc>
+        <w:tc>
+          <w:tcPr/>
+          <w:p>
+            <w:pPr>
+              <w:pStyle w:val="Compact"/>
+              <w:jc w:val="left"/>
+            </w:pPr>
+            <w:r>
+              <w:t xml:space="preserve">Bouton « 📄 Ouvrir le PDF »</w:t>
+            </w:r>
+          </w:p>
+        </w:tc>
+      </w:tr>
+      <w:tr>
+        <w:tc>
+          <w:tcPr/>
+          <w:p>
+            <w:pPr>
+              <w:pStyle w:val="Compact"/>
+              <w:jc w:val="left"/>
+            </w:pPr>
+            <w:r>
+              <w:t xml:space="preserve">« You can’t open apps in this environment… security group »</w:t>
+            </w:r>
+          </w:p>
+        </w:tc>
+        <w:tc>
+          <w:tcPr/>
+          <w:p>
+            <w:pPr>
+              <w:pStyle w:val="Compact"/>
+              <w:jc w:val="left"/>
+            </w:pPr>
+            <w:r>
+              <w:t xml:space="preserve">Le compte n’est pas dans le groupe de sécurité de l’environnement</w:t>
+            </w:r>
+          </w:p>
+        </w:tc>
+        <w:tc>
+          <w:tcPr/>
+          <w:p>
+            <w:pPr>
+              <w:pStyle w:val="Compact"/>
+              <w:jc w:val="left"/>
+            </w:pPr>
+            <w:r>
+              <w:t xml:space="preserve">Demander aux TI d’ajouter la personne (ou le groupe des utilisateurs)</w:t>
             </w:r>
           </w:p>
         </w:tc>

</xml_diff>

<commit_message>
Retrait des onglets Synthèse et Plan de développement et du PDF du plan ; documents à jour
Co-Authored-By: Claude Opus 5.5 <noreply@anthropic.com>
Claude-Session: https://claude.ai/code/session_01FRdAzq8p3F9gJJe5MA3G79
</commit_message>
<xml_diff>
--- a/powerapps/GUIDE-MISE-EN-PRODUCTION.docx
+++ b/powerapps/GUIDE-MISE-EN-PRODUCTION.docx
@@ -469,51 +469,6 @@
                 <w:b/>
               </w:rPr>
               <w:t xml:space="preserve">Aperçu PDF</w:t>
-            </w:r>
-          </w:p>
-        </w:tc>
-      </w:tr>
-      <w:tr>
-        <w:tc>
-          <w:tcPr/>
-          <w:p>
-            <w:pPr>
-              <w:pStyle w:val="Compact"/>
-              <w:jc w:val="left"/>
-            </w:pPr>
-            <w:r>
-              <w:rPr>
-                <w:rStyle w:val="VerbatimChar"/>
-              </w:rPr>
-              <w:t xml:space="preserve">btnImprimer-Plan-OnSelect.txt</w:t>
-            </w:r>
-          </w:p>
-        </w:tc>
-        <w:tc>
-          <w:tcPr/>
-          <w:p>
-            <w:pPr>
-              <w:pStyle w:val="Compact"/>
-              <w:jc w:val="left"/>
-            </w:pPr>
-            <w:r>
-              <w:t xml:space="preserve">La formule du bouton</w:t>
-            </w:r>
-            <w:r>
-              <w:t xml:space="preserve"> </w:t>
-            </w:r>
-            <w:r>
-              <w:rPr>
-                <w:bCs/>
-                <w:b/>
-              </w:rPr>
-              <w:t xml:space="preserve">Créer le PDF du plan</w:t>
-            </w:r>
-            <w:r>
-              <w:t xml:space="preserve"> </w:t>
-            </w:r>
-            <w:r>
-              <w:t xml:space="preserve">(onglet Plan)</w:t>
             </w:r>
           </w:p>
         </w:tc>
@@ -2625,19 +2580,29 @@
               <w:t xml:space="preserve">Print()</w:t>
             </w:r>
             <w:r>
-              <w:t xml:space="preserve">) donnait une page miniature.</w:t>
-            </w:r>
-          </w:p>
-        </w:tc>
-        <w:tc>
-          <w:tcPr/>
-          <w:p>
-            <w:pPr>
-              <w:pStyle w:val="Compact"/>
-              <w:jc w:val="left"/>
-            </w:pPr>
-            <w:r>
-              <w:t xml:space="preserve">Bouton « Créer le PDF du plan » : vrai PDF, joint au dossier.</w:t>
+              <w:t xml:space="preserve">) donnait une page miniature ; l’onglet a été jugé trop lourd.</w:t>
+            </w:r>
+          </w:p>
+        </w:tc>
+        <w:tc>
+          <w:tcPr/>
+          <w:p>
+            <w:pPr>
+              <w:pStyle w:val="Compact"/>
+              <w:jc w:val="left"/>
+            </w:pPr>
+            <w:r>
+              <w:rPr>
+                <w:bCs/>
+                <w:b/>
+              </w:rPr>
+              <w:t xml:space="preserve">Onglet Plan de développement supprimé</w:t>
+            </w:r>
+            <w:r>
+              <w:t xml:space="preserve"> </w:t>
+            </w:r>
+            <w:r>
+              <w:t xml:space="preserve">(panelPlan). Le contenu reste dans les sections A et D et dans le PDF complet.</w:t>
             </w:r>
           </w:p>
         </w:tc>
@@ -2675,19 +2640,35 @@
               <w:jc w:val="left"/>
             </w:pPr>
             <w:r>
-              <w:t xml:space="preserve">Trois boutons « Comment remplir » et un onglet Synthèse jugés superflus.</w:t>
-            </w:r>
-          </w:p>
-        </w:tc>
-        <w:tc>
-          <w:tcPr/>
-          <w:p>
-            <w:pPr>
-              <w:pStyle w:val="Compact"/>
-              <w:jc w:val="left"/>
-            </w:pPr>
-            <w:r>
-              <w:t xml:space="preserve">Un seul bouton d’aide (en haut à gauche) ; onglets Formulaire et Plan seulement.</w:t>
+              <w:t xml:space="preserve">Trois boutons « Comment remplir » et un onglet Synthèse jugés superflus ; erreur « Average avec une table vide ».</w:t>
+            </w:r>
+          </w:p>
+        </w:tc>
+        <w:tc>
+          <w:tcPr/>
+          <w:p>
+            <w:pPr>
+              <w:pStyle w:val="Compact"/>
+              <w:jc w:val="left"/>
+            </w:pPr>
+            <w:r>
+              <w:t xml:space="preserve">Un seul bouton d’aide (en haut à gauche) ;</w:t>
+            </w:r>
+            <w:r>
+              <w:t xml:space="preserve"> </w:t>
+            </w:r>
+            <w:r>
+              <w:rPr>
+                <w:bCs/>
+                <w:b/>
+              </w:rPr>
+              <w:t xml:space="preserve">panelSynthese supprimé</w:t>
+            </w:r>
+            <w:r>
+              <w:t xml:space="preserve"> </w:t>
+            </w:r>
+            <w:r>
+              <w:t xml:space="preserve">; barre d’onglets visible seulement dans l’aide (« ← Retour au formulaire »).</w:t>
             </w:r>
           </w:p>
         </w:tc>
@@ -4898,35 +4879,7 @@
         <w:t xml:space="preserve"> </w:t>
       </w:r>
       <w:r>
-        <w:t xml:space="preserve">et</w:t>
-      </w:r>
-      <w:r>
-        <w:t xml:space="preserve"> </w:t>
-      </w:r>
-      <w:r>
-        <w:rPr>
-          <w:rStyle w:val="VerbatimChar"/>
-        </w:rPr>
-        <w:t xml:space="preserve">btnImprimer-Plan-OnSelect.txt</w:t>
-      </w:r>
-      <w:r>
-        <w:t xml:space="preserve"> </w:t>
-      </w:r>
-      <w:r>
-        <w:t xml:space="preserve">dans</w:t>
-      </w:r>
-      <w:r>
-        <w:t xml:space="preserve"> </w:t>
-      </w:r>
-      <w:r>
-        <w:rPr>
-          <w:bCs/>
-          <w:b/>
-        </w:rPr>
-        <w:t xml:space="preserve">btnImprimer.OnSelect</w:t>
-      </w:r>
-      <w:r>
-        <w:t xml:space="preserve">, puis créer les boutons « 📄 Ouvrir le PDF » (formulaire) et « 📄 PDF » (Mes dossiers).</w:t>
+        <w:t xml:space="preserve">puis créer les boutons « 📄 Ouvrir le PDF » (formulaire) et « 📄 PDF » (Mes dossiers).</w:t>
       </w:r>
     </w:p>
     <w:p>
@@ -5654,7 +5607,7 @@
               <w:jc w:val="left"/>
             </w:pPr>
             <w:r>
-              <w:t xml:space="preserve">Un seul bouton d’aide ; onglets Formulaire et Plan ; « Créer le PDF du plan » joint un 2ᵉ PDF au dossier</w:t>
+              <w:t xml:space="preserve">Un seul bouton d’aide ; plus d’onglets Synthèse ni Plan ; aucune erreur dans le Vérificateur</w:t>
             </w:r>
           </w:p>
         </w:tc>

</xml_diff>